<commit_message>
fixed sign up page issues
</commit_message>
<xml_diff>
--- a/Documents/Template.docx
+++ b/Documents/Template.docx
@@ -167,15 +167,7 @@
         <w:t xml:space="preserve">This section discusses the Software Development Lifecycle (SDLC) and </w:t>
       </w:r>
       <w:r>
-        <w:t xml:space="preserve">describes how this is being used in this </w:t>
-      </w:r>
-      <w:proofErr w:type="gramStart"/>
-      <w:r>
-        <w:t>particular project</w:t>
-      </w:r>
-      <w:proofErr w:type="gramEnd"/>
-      <w:r>
-        <w:t xml:space="preserve">.  </w:t>
+        <w:t xml:space="preserve">describes how this is being used in this particular project.  </w:t>
       </w:r>
     </w:p>
     <w:p/>
@@ -196,21 +188,7 @@
         <w:rPr>
           <w:rStyle w:val="SubtleEmphasis"/>
         </w:rPr>
-        <w:t xml:space="preserve">there is a discussion about what the SDLC is and then what the author of the project has </w:t>
-      </w:r>
-      <w:proofErr w:type="gramStart"/>
-      <w:r>
-        <w:rPr>
-          <w:rStyle w:val="SubtleEmphasis"/>
-        </w:rPr>
-        <w:t>actually done</w:t>
-      </w:r>
-      <w:proofErr w:type="gramEnd"/>
-      <w:r>
-        <w:rPr>
-          <w:rStyle w:val="SubtleEmphasis"/>
-        </w:rPr>
-        <w:t xml:space="preserve"> with it.</w:t>
+        <w:t>there is a discussion about what the SDLC is and then what the author of the project has actually done with it.</w:t>
       </w:r>
       <w:r>
         <w:rPr>
@@ -246,13 +224,8 @@
     </w:p>
     <w:p/>
     <w:p>
-      <w:proofErr w:type="gramStart"/>
-      <w:r>
-        <w:t>Continuing on</w:t>
-      </w:r>
-      <w:proofErr w:type="gramEnd"/>
-      <w:r>
-        <w:t xml:space="preserve"> from the planning phase focus turned to the requirements phase.  </w:t>
+      <w:r>
+        <w:t xml:space="preserve">Continuing on from the planning phase focus turned to the requirements phase.  </w:t>
       </w:r>
       <w:r>
         <w:t xml:space="preserve">User stories were developed and aligned with the sprint plans.  </w:t>
@@ -2367,7 +2340,7 @@
           <w:lang w:eastAsia="en-GB"/>
         </w:rPr>
         <w:drawing>
-          <wp:inline distT="0" distB="0" distL="0" distR="0" wp14:anchorId="0D5F7DE6" wp14:editId="7F5E5DDA">
+          <wp:inline distT="0" distB="0" distL="0" distR="0" wp14:anchorId="0D5F7DE6" wp14:editId="00718491">
             <wp:extent cx="5384800" cy="2514600"/>
             <wp:effectExtent l="0" t="0" r="0" b="0"/>
             <wp:docPr id="18" name="Picture 18" descr="page9image47003872"/>

</xml_diff>